<commit_message>
update project 3 repport
</commit_message>
<xml_diff>
--- a/reports/Phase 3 Report.docx
+++ b/reports/Phase 3 Report.docx
@@ -104,12 +104,6 @@
         <w:gridCol w:w="4680"/>
       </w:tblGrid>
       <w:tr>
-        <w:tblPrEx>
-          <w:tblCellMar>
-            <w:top w:w="0" w:type="dxa"/>
-            <w:bottom w:w="0" w:type="dxa"/>
-          </w:tblCellMar>
-        </w:tblPrEx>
         <w:tc>
           <w:tcPr>
             <w:tcW w:w="4680" w:type="dxa"/>
@@ -172,12 +166,6 @@
         </w:tc>
       </w:tr>
       <w:tr>
-        <w:tblPrEx>
-          <w:tblCellMar>
-            <w:top w:w="0" w:type="dxa"/>
-            <w:bottom w:w="0" w:type="dxa"/>
-          </w:tblCellMar>
-        </w:tblPrEx>
         <w:tc>
           <w:tcPr>
             <w:tcW w:w="4680" w:type="dxa"/>
@@ -374,12 +362,6 @@
         <w:gridCol w:w="9360"/>
       </w:tblGrid>
       <w:tr>
-        <w:tblPrEx>
-          <w:tblCellMar>
-            <w:top w:w="0" w:type="dxa"/>
-            <w:bottom w:w="0" w:type="dxa"/>
-          </w:tblCellMar>
-        </w:tblPrEx>
         <w:tc>
           <w:tcPr>
             <w:tcW w:w="9360" w:type="dxa"/>
@@ -956,12 +938,6 @@
         <w:gridCol w:w="2560"/>
       </w:tblGrid>
       <w:tr>
-        <w:tblPrEx>
-          <w:tblCellMar>
-            <w:top w:w="0" w:type="dxa"/>
-            <w:bottom w:w="0" w:type="dxa"/>
-          </w:tblCellMar>
-        </w:tblPrEx>
         <w:tc>
           <w:tcPr>
             <w:tcW w:w="1800" w:type="dxa"/>
@@ -1084,12 +1060,6 @@
         </w:tc>
       </w:tr>
       <w:tr>
-        <w:tblPrEx>
-          <w:tblCellMar>
-            <w:top w:w="0" w:type="dxa"/>
-            <w:bottom w:w="0" w:type="dxa"/>
-          </w:tblCellMar>
-        </w:tblPrEx>
         <w:tc>
           <w:tcPr>
             <w:tcW w:w="1800" w:type="dxa"/>
@@ -1206,12 +1176,6 @@
         </w:tc>
       </w:tr>
       <w:tr>
-        <w:tblPrEx>
-          <w:tblCellMar>
-            <w:top w:w="0" w:type="dxa"/>
-            <w:bottom w:w="0" w:type="dxa"/>
-          </w:tblCellMar>
-        </w:tblPrEx>
         <w:tc>
           <w:tcPr>
             <w:tcW w:w="1800" w:type="dxa"/>
@@ -1319,12 +1283,6 @@
         </w:tc>
       </w:tr>
       <w:tr>
-        <w:tblPrEx>
-          <w:tblCellMar>
-            <w:top w:w="0" w:type="dxa"/>
-            <w:bottom w:w="0" w:type="dxa"/>
-          </w:tblCellMar>
-        </w:tblPrEx>
         <w:tc>
           <w:tcPr>
             <w:tcW w:w="1800" w:type="dxa"/>
@@ -1432,12 +1390,6 @@
         </w:tc>
       </w:tr>
       <w:tr>
-        <w:tblPrEx>
-          <w:tblCellMar>
-            <w:top w:w="0" w:type="dxa"/>
-            <w:bottom w:w="0" w:type="dxa"/>
-          </w:tblCellMar>
-        </w:tblPrEx>
         <w:tc>
           <w:tcPr>
             <w:tcW w:w="1800" w:type="dxa"/>
@@ -1561,12 +1513,6 @@
         </w:tc>
       </w:tr>
       <w:tr>
-        <w:tblPrEx>
-          <w:tblCellMar>
-            <w:top w:w="0" w:type="dxa"/>
-            <w:bottom w:w="0" w:type="dxa"/>
-          </w:tblCellMar>
-        </w:tblPrEx>
         <w:tc>
           <w:tcPr>
             <w:tcW w:w="1800" w:type="dxa"/>
@@ -1674,12 +1620,6 @@
         </w:tc>
       </w:tr>
       <w:tr>
-        <w:tblPrEx>
-          <w:tblCellMar>
-            <w:top w:w="0" w:type="dxa"/>
-            <w:bottom w:w="0" w:type="dxa"/>
-          </w:tblCellMar>
-        </w:tblPrEx>
         <w:tc>
           <w:tcPr>
             <w:tcW w:w="1800" w:type="dxa"/>
@@ -1787,12 +1727,6 @@
         </w:tc>
       </w:tr>
       <w:tr>
-        <w:tblPrEx>
-          <w:tblCellMar>
-            <w:top w:w="0" w:type="dxa"/>
-            <w:bottom w:w="0" w:type="dxa"/>
-          </w:tblCellMar>
-        </w:tblPrEx>
         <w:tc>
           <w:tcPr>
             <w:tcW w:w="1800" w:type="dxa"/>
@@ -1900,12 +1834,6 @@
         </w:tc>
       </w:tr>
       <w:tr>
-        <w:tblPrEx>
-          <w:tblCellMar>
-            <w:top w:w="0" w:type="dxa"/>
-            <w:bottom w:w="0" w:type="dxa"/>
-          </w:tblCellMar>
-        </w:tblPrEx>
         <w:tc>
           <w:tcPr>
             <w:tcW w:w="1800" w:type="dxa"/>
@@ -2827,12 +2755,6 @@
         <w:gridCol w:w="1591"/>
       </w:tblGrid>
       <w:tr>
-        <w:tblPrEx>
-          <w:tblCellMar>
-            <w:top w:w="0" w:type="dxa"/>
-            <w:bottom w:w="0" w:type="dxa"/>
-          </w:tblCellMar>
-        </w:tblPrEx>
         <w:tc>
           <w:tcPr>
             <w:tcW w:w="3000" w:type="dxa"/>
@@ -2985,12 +2907,6 @@
         </w:tc>
       </w:tr>
       <w:tr>
-        <w:tblPrEx>
-          <w:tblCellMar>
-            <w:top w:w="0" w:type="dxa"/>
-            <w:bottom w:w="0" w:type="dxa"/>
-          </w:tblCellMar>
-        </w:tblPrEx>
         <w:tc>
           <w:tcPr>
             <w:tcW w:w="3000" w:type="dxa"/>
@@ -3124,12 +3040,6 @@
         </w:tc>
       </w:tr>
       <w:tr>
-        <w:tblPrEx>
-          <w:tblCellMar>
-            <w:top w:w="0" w:type="dxa"/>
-            <w:bottom w:w="0" w:type="dxa"/>
-          </w:tblCellMar>
-        </w:tblPrEx>
         <w:tc>
           <w:tcPr>
             <w:tcW w:w="3000" w:type="dxa"/>
@@ -3262,12 +3172,6 @@
         </w:tc>
       </w:tr>
       <w:tr>
-        <w:tblPrEx>
-          <w:tblCellMar>
-            <w:top w:w="0" w:type="dxa"/>
-            <w:bottom w:w="0" w:type="dxa"/>
-          </w:tblCellMar>
-        </w:tblPrEx>
         <w:tc>
           <w:tcPr>
             <w:tcW w:w="3000" w:type="dxa"/>
@@ -3414,12 +3318,6 @@
         </w:tc>
       </w:tr>
       <w:tr>
-        <w:tblPrEx>
-          <w:tblCellMar>
-            <w:top w:w="0" w:type="dxa"/>
-            <w:bottom w:w="0" w:type="dxa"/>
-          </w:tblCellMar>
-        </w:tblPrEx>
         <w:tc>
           <w:tcPr>
             <w:tcW w:w="3000" w:type="dxa"/>
@@ -3832,12 +3730,6 @@
         <w:gridCol w:w="5760"/>
       </w:tblGrid>
       <w:tr>
-        <w:tblPrEx>
-          <w:tblCellMar>
-            <w:top w:w="0" w:type="dxa"/>
-            <w:bottom w:w="0" w:type="dxa"/>
-          </w:tblCellMar>
-        </w:tblPrEx>
         <w:tc>
           <w:tcPr>
             <w:tcW w:w="3600" w:type="dxa"/>
@@ -3900,12 +3792,6 @@
         </w:tc>
       </w:tr>
       <w:tr>
-        <w:tblPrEx>
-          <w:tblCellMar>
-            <w:top w:w="0" w:type="dxa"/>
-            <w:bottom w:w="0" w:type="dxa"/>
-          </w:tblCellMar>
-        </w:tblPrEx>
         <w:tc>
           <w:tcPr>
             <w:tcW w:w="3600" w:type="dxa"/>
@@ -3961,12 +3847,6 @@
         </w:tc>
       </w:tr>
       <w:tr>
-        <w:tblPrEx>
-          <w:tblCellMar>
-            <w:top w:w="0" w:type="dxa"/>
-            <w:bottom w:w="0" w:type="dxa"/>
-          </w:tblCellMar>
-        </w:tblPrEx>
         <w:tc>
           <w:tcPr>
             <w:tcW w:w="3600" w:type="dxa"/>
@@ -4038,12 +3918,6 @@
         </w:tc>
       </w:tr>
       <w:tr>
-        <w:tblPrEx>
-          <w:tblCellMar>
-            <w:top w:w="0" w:type="dxa"/>
-            <w:bottom w:w="0" w:type="dxa"/>
-          </w:tblCellMar>
-        </w:tblPrEx>
         <w:tc>
           <w:tcPr>
             <w:tcW w:w="3600" w:type="dxa"/>
@@ -4099,12 +3973,6 @@
         </w:tc>
       </w:tr>
       <w:tr>
-        <w:tblPrEx>
-          <w:tblCellMar>
-            <w:top w:w="0" w:type="dxa"/>
-            <w:bottom w:w="0" w:type="dxa"/>
-          </w:tblCellMar>
-        </w:tblPrEx>
         <w:tc>
           <w:tcPr>
             <w:tcW w:w="3600" w:type="dxa"/>
@@ -4175,12 +4043,6 @@
         </w:tc>
       </w:tr>
       <w:tr>
-        <w:tblPrEx>
-          <w:tblCellMar>
-            <w:top w:w="0" w:type="dxa"/>
-            <w:bottom w:w="0" w:type="dxa"/>
-          </w:tblCellMar>
-        </w:tblPrEx>
         <w:tc>
           <w:tcPr>
             <w:tcW w:w="3600" w:type="dxa"/>
@@ -4236,12 +4098,6 @@
         </w:tc>
       </w:tr>
       <w:tr>
-        <w:tblPrEx>
-          <w:tblCellMar>
-            <w:top w:w="0" w:type="dxa"/>
-            <w:bottom w:w="0" w:type="dxa"/>
-          </w:tblCellMar>
-        </w:tblPrEx>
         <w:tc>
           <w:tcPr>
             <w:tcW w:w="3600" w:type="dxa"/>
@@ -4296,12 +4152,6 @@
         </w:tc>
       </w:tr>
       <w:tr>
-        <w:tblPrEx>
-          <w:tblCellMar>
-            <w:top w:w="0" w:type="dxa"/>
-            <w:bottom w:w="0" w:type="dxa"/>
-          </w:tblCellMar>
-        </w:tblPrEx>
         <w:tc>
           <w:tcPr>
             <w:tcW w:w="3600" w:type="dxa"/>
@@ -4405,12 +4255,6 @@
         <w:gridCol w:w="7160"/>
       </w:tblGrid>
       <w:tr>
-        <w:tblPrEx>
-          <w:tblCellMar>
-            <w:top w:w="0" w:type="dxa"/>
-            <w:bottom w:w="0" w:type="dxa"/>
-          </w:tblCellMar>
-        </w:tblPrEx>
         <w:tc>
           <w:tcPr>
             <w:tcW w:w="2200" w:type="dxa"/>
@@ -4473,12 +4317,6 @@
         </w:tc>
       </w:tr>
       <w:tr>
-        <w:tblPrEx>
-          <w:tblCellMar>
-            <w:top w:w="0" w:type="dxa"/>
-            <w:bottom w:w="0" w:type="dxa"/>
-          </w:tblCellMar>
-        </w:tblPrEx>
         <w:tc>
           <w:tcPr>
             <w:tcW w:w="2200" w:type="dxa"/>
@@ -4559,12 +4397,6 @@
         </w:tc>
       </w:tr>
       <w:tr>
-        <w:tblPrEx>
-          <w:tblCellMar>
-            <w:top w:w="0" w:type="dxa"/>
-            <w:bottom w:w="0" w:type="dxa"/>
-          </w:tblCellMar>
-        </w:tblPrEx>
         <w:tc>
           <w:tcPr>
             <w:tcW w:w="2200" w:type="dxa"/>
@@ -4619,12 +4451,6 @@
         </w:tc>
       </w:tr>
       <w:tr>
-        <w:tblPrEx>
-          <w:tblCellMar>
-            <w:top w:w="0" w:type="dxa"/>
-            <w:bottom w:w="0" w:type="dxa"/>
-          </w:tblCellMar>
-        </w:tblPrEx>
         <w:tc>
           <w:tcPr>
             <w:tcW w:w="2200" w:type="dxa"/>
@@ -4680,12 +4506,6 @@
         </w:tc>
       </w:tr>
       <w:tr>
-        <w:tblPrEx>
-          <w:tblCellMar>
-            <w:top w:w="0" w:type="dxa"/>
-            <w:bottom w:w="0" w:type="dxa"/>
-          </w:tblCellMar>
-        </w:tblPrEx>
         <w:tc>
           <w:tcPr>
             <w:tcW w:w="2200" w:type="dxa"/>
@@ -4756,12 +4576,6 @@
         </w:tc>
       </w:tr>
       <w:tr>
-        <w:tblPrEx>
-          <w:tblCellMar>
-            <w:top w:w="0" w:type="dxa"/>
-            <w:bottom w:w="0" w:type="dxa"/>
-          </w:tblCellMar>
-        </w:tblPrEx>
         <w:tc>
           <w:tcPr>
             <w:tcW w:w="2200" w:type="dxa"/>
@@ -4997,12 +4811,6 @@
         <w:gridCol w:w="5860"/>
       </w:tblGrid>
       <w:tr>
-        <w:tblPrEx>
-          <w:tblCellMar>
-            <w:top w:w="0" w:type="dxa"/>
-            <w:bottom w:w="0" w:type="dxa"/>
-          </w:tblCellMar>
-        </w:tblPrEx>
         <w:tc>
           <w:tcPr>
             <w:tcW w:w="3500" w:type="dxa"/>
@@ -5065,12 +4873,6 @@
         </w:tc>
       </w:tr>
       <w:tr>
-        <w:tblPrEx>
-          <w:tblCellMar>
-            <w:top w:w="0" w:type="dxa"/>
-            <w:bottom w:w="0" w:type="dxa"/>
-          </w:tblCellMar>
-        </w:tblPrEx>
         <w:tc>
           <w:tcPr>
             <w:tcW w:w="3500" w:type="dxa"/>
@@ -5126,12 +4928,6 @@
         </w:tc>
       </w:tr>
       <w:tr>
-        <w:tblPrEx>
-          <w:tblCellMar>
-            <w:top w:w="0" w:type="dxa"/>
-            <w:bottom w:w="0" w:type="dxa"/>
-          </w:tblCellMar>
-        </w:tblPrEx>
         <w:tc>
           <w:tcPr>
             <w:tcW w:w="3500" w:type="dxa"/>
@@ -5186,12 +4982,6 @@
         </w:tc>
       </w:tr>
       <w:tr>
-        <w:tblPrEx>
-          <w:tblCellMar>
-            <w:top w:w="0" w:type="dxa"/>
-            <w:bottom w:w="0" w:type="dxa"/>
-          </w:tblCellMar>
-        </w:tblPrEx>
         <w:tc>
           <w:tcPr>
             <w:tcW w:w="3500" w:type="dxa"/>
@@ -5247,12 +5037,6 @@
         </w:tc>
       </w:tr>
       <w:tr>
-        <w:tblPrEx>
-          <w:tblCellMar>
-            <w:top w:w="0" w:type="dxa"/>
-            <w:bottom w:w="0" w:type="dxa"/>
-          </w:tblCellMar>
-        </w:tblPrEx>
         <w:tc>
           <w:tcPr>
             <w:tcW w:w="3500" w:type="dxa"/>
@@ -5307,12 +5091,6 @@
         </w:tc>
       </w:tr>
       <w:tr>
-        <w:tblPrEx>
-          <w:tblCellMar>
-            <w:top w:w="0" w:type="dxa"/>
-            <w:bottom w:w="0" w:type="dxa"/>
-          </w:tblCellMar>
-        </w:tblPrEx>
         <w:tc>
           <w:tcPr>
             <w:tcW w:w="3500" w:type="dxa"/>
@@ -5368,12 +5146,6 @@
         </w:tc>
       </w:tr>
       <w:tr>
-        <w:tblPrEx>
-          <w:tblCellMar>
-            <w:top w:w="0" w:type="dxa"/>
-            <w:bottom w:w="0" w:type="dxa"/>
-          </w:tblCellMar>
-        </w:tblPrEx>
         <w:tc>
           <w:tcPr>
             <w:tcW w:w="3500" w:type="dxa"/>
@@ -5428,12 +5200,6 @@
         </w:tc>
       </w:tr>
       <w:tr>
-        <w:tblPrEx>
-          <w:tblCellMar>
-            <w:top w:w="0" w:type="dxa"/>
-            <w:bottom w:w="0" w:type="dxa"/>
-          </w:tblCellMar>
-        </w:tblPrEx>
         <w:tc>
           <w:tcPr>
             <w:tcW w:w="3500" w:type="dxa"/>
@@ -5489,12 +5255,6 @@
         </w:tc>
       </w:tr>
       <w:tr>
-        <w:tblPrEx>
-          <w:tblCellMar>
-            <w:top w:w="0" w:type="dxa"/>
-            <w:bottom w:w="0" w:type="dxa"/>
-          </w:tblCellMar>
-        </w:tblPrEx>
         <w:tc>
           <w:tcPr>
             <w:tcW w:w="3500" w:type="dxa"/>
@@ -5549,12 +5309,6 @@
         </w:tc>
       </w:tr>
       <w:tr>
-        <w:tblPrEx>
-          <w:tblCellMar>
-            <w:top w:w="0" w:type="dxa"/>
-            <w:bottom w:w="0" w:type="dxa"/>
-          </w:tblCellMar>
-        </w:tblPrEx>
         <w:tc>
           <w:tcPr>
             <w:tcW w:w="3500" w:type="dxa"/>
@@ -5610,12 +5364,6 @@
         </w:tc>
       </w:tr>
       <w:tr>
-        <w:tblPrEx>
-          <w:tblCellMar>
-            <w:top w:w="0" w:type="dxa"/>
-            <w:bottom w:w="0" w:type="dxa"/>
-          </w:tblCellMar>
-        </w:tblPrEx>
         <w:tc>
           <w:tcPr>
             <w:tcW w:w="3500" w:type="dxa"/>
@@ -5855,12 +5603,6 @@
         <w:gridCol w:w="1600"/>
       </w:tblGrid>
       <w:tr>
-        <w:tblPrEx>
-          <w:tblCellMar>
-            <w:top w:w="0" w:type="dxa"/>
-            <w:bottom w:w="0" w:type="dxa"/>
-          </w:tblCellMar>
-        </w:tblPrEx>
         <w:tc>
           <w:tcPr>
             <w:tcW w:w="2200" w:type="dxa"/>
@@ -5954,12 +5696,6 @@
         </w:tc>
       </w:tr>
       <w:tr>
-        <w:tblPrEx>
-          <w:tblCellMar>
-            <w:top w:w="0" w:type="dxa"/>
-            <w:bottom w:w="0" w:type="dxa"/>
-          </w:tblCellMar>
-        </w:tblPrEx>
         <w:tc>
           <w:tcPr>
             <w:tcW w:w="2200" w:type="dxa"/>
@@ -6080,15 +5816,7 @@
                 <w:sz w:val="20"/>
                 <w:szCs w:val="20"/>
               </w:rPr>
-              <w:t>reproduce.sh, RUN.md, smoke tests</w:t>
-            </w:r>
-            <w:proofErr w:type="gramStart"/>
-            <w:r>
-              <w:rPr>
-                <w:sz w:val="20"/>
-                <w:szCs w:val="20"/>
-              </w:rPr>
-              <w:t>, .</w:t>
+              <w:t>reproduce.sh, RUN.md, smoke tests, .</w:t>
             </w:r>
             <w:proofErr w:type="spellStart"/>
             <w:r>
@@ -6096,15 +5824,7 @@
                 <w:sz w:val="20"/>
                 <w:szCs w:val="20"/>
               </w:rPr>
-              <w:t>env</w:t>
-            </w:r>
-            <w:proofErr w:type="gramEnd"/>
-            <w:r>
-              <w:rPr>
-                <w:sz w:val="20"/>
-                <w:szCs w:val="20"/>
-              </w:rPr>
-              <w:t>.example</w:t>
+              <w:t>env.example</w:t>
             </w:r>
             <w:proofErr w:type="spellEnd"/>
             <w:r>
@@ -6112,7 +5832,7 @@
                 <w:sz w:val="20"/>
                 <w:szCs w:val="20"/>
               </w:rPr>
-              <w:t xml:space="preserve"> fix, Snowflake VECTOR migration (VARCHAR to VECTOR(FLOAT,768))</w:t>
+              <w:t xml:space="preserve"> fix</w:t>
             </w:r>
           </w:p>
           <w:p>
@@ -6184,12 +5904,6 @@
         </w:tc>
       </w:tr>
       <w:tr>
-        <w:tblPrEx>
-          <w:tblCellMar>
-            <w:top w:w="0" w:type="dxa"/>
-            <w:bottom w:w="0" w:type="dxa"/>
-          </w:tblCellMar>
-        </w:tblPrEx>
         <w:tc>
           <w:tcPr>
             <w:tcW w:w="2200" w:type="dxa"/>
@@ -6424,12 +6138,6 @@
         </w:tc>
       </w:tr>
       <w:tr>
-        <w:tblPrEx>
-          <w:tblCellMar>
-            <w:top w:w="0" w:type="dxa"/>
-            <w:bottom w:w="0" w:type="dxa"/>
-          </w:tblCellMar>
-        </w:tblPrEx>
         <w:tc>
           <w:tcPr>
             <w:tcW w:w="2200" w:type="dxa"/>
@@ -6617,12 +6325,6 @@
         </w:tc>
       </w:tr>
       <w:tr>
-        <w:tblPrEx>
-          <w:tblCellMar>
-            <w:top w:w="0" w:type="dxa"/>
-            <w:bottom w:w="0" w:type="dxa"/>
-          </w:tblCellMar>
-        </w:tblPrEx>
         <w:tc>
           <w:tcPr>
             <w:tcW w:w="2200" w:type="dxa"/>
@@ -6987,7 +6689,6 @@
           <w:sz w:val="18"/>
           <w:szCs w:val="18"/>
         </w:rPr>
-        <w:lastRenderedPageBreak/>
         <w:t>+-- requirements.txt      Full local dependencies</w:t>
       </w:r>
     </w:p>
@@ -7001,6 +6702,7 @@
           <w:sz w:val="18"/>
           <w:szCs w:val="18"/>
         </w:rPr>
+        <w:lastRenderedPageBreak/>
         <w:t>+</w:t>
       </w:r>
       <w:proofErr w:type="gramStart"/>

</xml_diff>